<commit_message>
Reprogrammed face tracking loop to use NiceGUI's ui.timer loop. Fixed issues with gauge, calibrating, and the settings page. Calibration feature is now functional.
</commit_message>
<xml_diff>
--- a/Feedback and Testing.docx
+++ b/Feedback and Testing.docx
@@ -93,6 +93,164 @@
       </w:r>
     </w:p>
     <w:p>
+      <w:pPr>
+        <w:pStyle w:val="ListParagraph"/>
+      </w:pPr>
+    </w:p>
+    <w:p>
+      <w:pPr>
+        <w:pStyle w:val="ListParagraph"/>
+      </w:pPr>
+      <w:proofErr w:type="spellStart"/>
+      <w:r>
+        <w:t>NiceGUI</w:t>
+      </w:r>
+      <w:proofErr w:type="spellEnd"/>
+      <w:r>
+        <w:t xml:space="preserve"> has loading icons built in, so I will be using them to create the loading screen.</w:t>
+      </w:r>
+    </w:p>
+    <w:p>
+      <w:pPr>
+        <w:pStyle w:val="ListParagraph"/>
+      </w:pPr>
+      <w:hyperlink r:id="rId5" w:history="1">
+        <w:r>
+          <w:rPr>
+            <w:rStyle w:val="Hyperlink"/>
+          </w:rPr>
+          <w:t>https://nicegui.io/documentation/spinner</w:t>
+        </w:r>
+      </w:hyperlink>
+    </w:p>
+    <w:p>
+      <w:pPr>
+        <w:pStyle w:val="ListParagraph"/>
+      </w:pPr>
+      <w:r>
+        <w:rPr>
+          <w:noProof/>
+        </w:rPr>
+        <w:drawing>
+          <wp:inline distT="0" distB="0" distL="0" distR="0" wp14:anchorId="13C2E7AB" wp14:editId="0E1E49A0">
+            <wp:extent cx="5731510" cy="1351280"/>
+            <wp:effectExtent l="0" t="0" r="2540" b="1270"/>
+            <wp:docPr id="571794498" name="Picture 1"/>
+            <wp:cNvGraphicFramePr>
+              <a:graphicFrameLocks xmlns:a="http://schemas.openxmlformats.org/drawingml/2006/main" noChangeAspect="1"/>
+            </wp:cNvGraphicFramePr>
+            <a:graphic xmlns:a="http://schemas.openxmlformats.org/drawingml/2006/main">
+              <a:graphicData uri="http://schemas.openxmlformats.org/drawingml/2006/picture">
+                <pic:pic xmlns:pic="http://schemas.openxmlformats.org/drawingml/2006/picture">
+                  <pic:nvPicPr>
+                    <pic:cNvPr id="571794498" name=""/>
+                    <pic:cNvPicPr/>
+                  </pic:nvPicPr>
+                  <pic:blipFill>
+                    <a:blip r:embed="rId6"/>
+                    <a:stretch>
+                      <a:fillRect/>
+                    </a:stretch>
+                  </pic:blipFill>
+                  <pic:spPr>
+                    <a:xfrm>
+                      <a:off x="0" y="0"/>
+                      <a:ext cx="5731510" cy="1351280"/>
+                    </a:xfrm>
+                    <a:prstGeom prst="rect">
+                      <a:avLst/>
+                    </a:prstGeom>
+                  </pic:spPr>
+                </pic:pic>
+              </a:graphicData>
+            </a:graphic>
+          </wp:inline>
+        </w:drawing>
+      </w:r>
+    </w:p>
+    <w:p>
+      <w:pPr>
+        <w:pStyle w:val="ListParagraph"/>
+      </w:pPr>
+      <w:r>
+        <w:rPr>
+          <w:noProof/>
+        </w:rPr>
+        <w:drawing>
+          <wp:anchor distT="0" distB="0" distL="114300" distR="114300" simplePos="0" relativeHeight="251661312" behindDoc="0" locked="0" layoutInCell="1" allowOverlap="1" wp14:anchorId="5F391EEE" wp14:editId="6FA61296">
+            <wp:simplePos x="0" y="0"/>
+            <wp:positionH relativeFrom="column">
+              <wp:posOffset>4138295</wp:posOffset>
+            </wp:positionH>
+            <wp:positionV relativeFrom="paragraph">
+              <wp:posOffset>12065</wp:posOffset>
+            </wp:positionV>
+            <wp:extent cx="1419225" cy="1005840"/>
+            <wp:effectExtent l="0" t="0" r="0" b="3810"/>
+            <wp:wrapSquare wrapText="bothSides"/>
+            <wp:docPr id="1011183924" name="Picture 1"/>
+            <wp:cNvGraphicFramePr>
+              <a:graphicFrameLocks xmlns:a="http://schemas.openxmlformats.org/drawingml/2006/main" noChangeAspect="1"/>
+            </wp:cNvGraphicFramePr>
+            <a:graphic xmlns:a="http://schemas.openxmlformats.org/drawingml/2006/main">
+              <a:graphicData uri="http://schemas.openxmlformats.org/drawingml/2006/picture">
+                <pic:pic xmlns:pic="http://schemas.openxmlformats.org/drawingml/2006/picture">
+                  <pic:nvPicPr>
+                    <pic:cNvPr id="1011183924" name=""/>
+                    <pic:cNvPicPr/>
+                  </pic:nvPicPr>
+                  <pic:blipFill>
+                    <a:blip r:embed="rId7" cstate="print">
+                      <a:extLst>
+                        <a:ext uri="{28A0092B-C50C-407E-A947-70E740481C1C}">
+                          <a14:useLocalDpi xmlns:a14="http://schemas.microsoft.com/office/drawing/2010/main" val="0"/>
+                        </a:ext>
+                      </a:extLst>
+                    </a:blip>
+                    <a:stretch>
+                      <a:fillRect/>
+                    </a:stretch>
+                  </pic:blipFill>
+                  <pic:spPr>
+                    <a:xfrm>
+                      <a:off x="0" y="0"/>
+                      <a:ext cx="1419225" cy="1005840"/>
+                    </a:xfrm>
+                    <a:prstGeom prst="rect">
+                      <a:avLst/>
+                    </a:prstGeom>
+                  </pic:spPr>
+                </pic:pic>
+              </a:graphicData>
+            </a:graphic>
+          </wp:anchor>
+        </w:drawing>
+      </w:r>
+      <w:r>
+        <w:t>For 4 seconds when the app starts, a loading screen will be shown to allow time for the Wah to initialise.</w:t>
+      </w:r>
+    </w:p>
+    <w:p>
+      <w:pPr>
+        <w:pStyle w:val="ListParagraph"/>
+      </w:pPr>
+    </w:p>
+    <w:p>
+      <w:pPr>
+        <w:pStyle w:val="ListParagraph"/>
+      </w:pPr>
+    </w:p>
+    <w:p>
+      <w:pPr>
+        <w:pStyle w:val="ListParagraph"/>
+      </w:pPr>
+    </w:p>
+    <w:p>
+      <w:pPr>
+        <w:pStyle w:val="ListParagraph"/>
+      </w:pPr>
+    </w:p>
+    <w:p>
       <w:r>
         <w:t>Peer 2:</w:t>
       </w:r>
@@ -125,9 +283,11 @@
       <w:r>
         <w:t xml:space="preserve">I showed her 4 different colour </w:t>
       </w:r>
+      <w:proofErr w:type="gramStart"/>
       <w:r>
         <w:t>schemes,</w:t>
       </w:r>
+      <w:proofErr w:type="gramEnd"/>
       <w:r>
         <w:t xml:space="preserve"> </w:t>
       </w:r>
@@ -184,6 +344,11 @@
       </w:r>
     </w:p>
     <w:p>
+      <w:pPr>
+        <w:pStyle w:val="ListParagraph"/>
+      </w:pPr>
+    </w:p>
+    <w:p>
       <w:r>
         <w:t>Peer 3:</w:t>
       </w:r>
@@ -202,10 +367,16 @@
         </w:numPr>
       </w:pPr>
       <w:r>
+        <w:lastRenderedPageBreak/>
         <w:t xml:space="preserve">Complained that he didn’t understand what the settings sliders </w:t>
       </w:r>
-      <w:r>
-        <w:t>actually did.</w:t>
+      <w:proofErr w:type="gramStart"/>
+      <w:r>
+        <w:t>actually did</w:t>
+      </w:r>
+      <w:proofErr w:type="gramEnd"/>
+      <w:r>
+        <w:t>.</w:t>
       </w:r>
     </w:p>
     <w:p>
@@ -218,6 +389,51 @@
       </w:pPr>
       <w:r>
         <w:t>I will add a short explanation to the calibration and settings page to make sure the user knows how to use them and what they do.</w:t>
+      </w:r>
+    </w:p>
+    <w:p>
+      <w:pPr>
+        <w:pStyle w:val="ListParagraph"/>
+      </w:pPr>
+      <w:r>
+        <w:rPr>
+          <w:noProof/>
+        </w:rPr>
+        <w:drawing>
+          <wp:inline distT="0" distB="0" distL="0" distR="0" wp14:anchorId="11C1A049" wp14:editId="594B77D5">
+            <wp:extent cx="3495675" cy="1451561"/>
+            <wp:effectExtent l="0" t="0" r="0" b="0"/>
+            <wp:docPr id="1300706049" name="Picture 1"/>
+            <wp:cNvGraphicFramePr>
+              <a:graphicFrameLocks xmlns:a="http://schemas.openxmlformats.org/drawingml/2006/main" noChangeAspect="1"/>
+            </wp:cNvGraphicFramePr>
+            <a:graphic xmlns:a="http://schemas.openxmlformats.org/drawingml/2006/main">
+              <a:graphicData uri="http://schemas.openxmlformats.org/drawingml/2006/picture">
+                <pic:pic xmlns:pic="http://schemas.openxmlformats.org/drawingml/2006/picture">
+                  <pic:nvPicPr>
+                    <pic:cNvPr id="1300706049" name=""/>
+                    <pic:cNvPicPr/>
+                  </pic:nvPicPr>
+                  <pic:blipFill>
+                    <a:blip r:embed="rId8"/>
+                    <a:stretch>
+                      <a:fillRect/>
+                    </a:stretch>
+                  </pic:blipFill>
+                  <pic:spPr>
+                    <a:xfrm>
+                      <a:off x="0" y="0"/>
+                      <a:ext cx="3499513" cy="1453155"/>
+                    </a:xfrm>
+                    <a:prstGeom prst="rect">
+                      <a:avLst/>
+                    </a:prstGeom>
+                  </pic:spPr>
+                </pic:pic>
+              </a:graphicData>
+            </a:graphic>
+          </wp:inline>
+        </w:drawing>
       </w:r>
     </w:p>
     <w:p>
@@ -309,7 +525,7 @@
                     <pic:cNvPicPr/>
                   </pic:nvPicPr>
                   <pic:blipFill>
-                    <a:blip r:embed="rId5"/>
+                    <a:blip r:embed="rId9"/>
                     <a:stretch>
                       <a:fillRect/>
                     </a:stretch>
@@ -381,7 +597,7 @@
                     <pic:cNvPicPr/>
                   </pic:nvPicPr>
                   <pic:blipFill>
-                    <a:blip r:embed="rId6"/>
+                    <a:blip r:embed="rId10"/>
                     <a:stretch>
                       <a:fillRect/>
                     </a:stretch>
@@ -433,7 +649,7 @@
                     <pic:cNvPicPr/>
                   </pic:nvPicPr>
                   <pic:blipFill>
-                    <a:blip r:embed="rId7"/>
+                    <a:blip r:embed="rId11"/>
                     <a:stretch>
                       <a:fillRect/>
                     </a:stretch>
@@ -485,6 +701,7 @@
           <w:b/>
           <w:bCs/>
         </w:rPr>
+        <w:lastRenderedPageBreak/>
         <w:t>What’s being tested:</w:t>
       </w:r>
       <w:r>
@@ -495,7 +712,15 @@
         <w:t xml:space="preserve"> </w:t>
       </w:r>
       <w:r>
-        <w:t>Expected output when settings sliders are dragged. Releasing the slide should immediately update the value of the setting in the settings.json file.</w:t>
+        <w:t xml:space="preserve">Expected output when settings sliders are dragged. Releasing the slide should immediately update the value of the setting in the </w:t>
+      </w:r>
+      <w:proofErr w:type="spellStart"/>
+      <w:r>
+        <w:t>settings.json</w:t>
+      </w:r>
+      <w:proofErr w:type="spellEnd"/>
+      <w:r>
+        <w:t xml:space="preserve"> file.</w:t>
       </w:r>
     </w:p>
     <w:p>
@@ -670,7 +895,7 @@
                     <pic:cNvPicPr/>
                   </pic:nvPicPr>
                   <pic:blipFill>
-                    <a:blip r:embed="rId8"/>
+                    <a:blip r:embed="rId12"/>
                     <a:stretch>
                       <a:fillRect/>
                     </a:stretch>
@@ -723,7 +948,7 @@
                     <pic:cNvPicPr/>
                   </pic:nvPicPr>
                   <pic:blipFill>
-                    <a:blip r:embed="rId9"/>
+                    <a:blip r:embed="rId13"/>
                     <a:stretch>
                       <a:fillRect/>
                     </a:stretch>
@@ -793,7 +1018,15 @@
         <w:t xml:space="preserve"> error when ran without a MIDI port open.</w:t>
       </w:r>
       <w:r>
-        <w:t xml:space="preserve"> Also bad</w:t>
+        <w:t xml:space="preserve"> </w:t>
+      </w:r>
+      <w:proofErr w:type="gramStart"/>
+      <w:r>
+        <w:t>Also</w:t>
+      </w:r>
+      <w:proofErr w:type="gramEnd"/>
+      <w:r>
+        <w:t xml:space="preserve"> bad</w:t>
       </w:r>
       <w:r>
         <w:t xml:space="preserve"> visibility of system status since user is not shown any notification,</w:t>
@@ -820,7 +1053,7 @@
                     <pic:cNvPicPr/>
                   </pic:nvPicPr>
                   <pic:blipFill>
-                    <a:blip r:embed="rId10"/>
+                    <a:blip r:embed="rId14"/>
                     <a:stretch>
                       <a:fillRect/>
                     </a:stretch>
@@ -869,11 +1102,22 @@
         <w:t xml:space="preserve">Implemented an error notification </w:t>
       </w:r>
       <w:r>
-        <w:t>that appears if no MIDI port is dected.</w:t>
-      </w:r>
-    </w:p>
-    <w:p>
-      <w:r>
+        <w:t xml:space="preserve">that appears if no MIDI port is </w:t>
+      </w:r>
+      <w:proofErr w:type="spellStart"/>
+      <w:r>
+        <w:t>dected</w:t>
+      </w:r>
+      <w:proofErr w:type="spellEnd"/>
+      <w:r>
+        <w:t>.</w:t>
+      </w:r>
+    </w:p>
+    <w:p>
+      <w:r>
+        <w:rPr>
+          <w:noProof/>
+        </w:rPr>
         <w:drawing>
           <wp:inline distT="0" distB="0" distL="0" distR="0" wp14:anchorId="60EA7312" wp14:editId="1B4EB964">
             <wp:extent cx="3271838" cy="928700"/>
@@ -890,7 +1134,7 @@
                     <pic:cNvPicPr/>
                   </pic:nvPicPr>
                   <pic:blipFill>
-                    <a:blip r:embed="rId11"/>
+                    <a:blip r:embed="rId15"/>
                     <a:stretch>
                       <a:fillRect/>
                     </a:stretch>
@@ -913,6 +1157,9 @@
     </w:p>
     <w:p>
       <w:r>
+        <w:rPr>
+          <w:noProof/>
+        </w:rPr>
         <w:drawing>
           <wp:inline distT="0" distB="0" distL="0" distR="0" wp14:anchorId="4EA12529" wp14:editId="753BF19B">
             <wp:extent cx="5731510" cy="471805"/>
@@ -929,7 +1176,7 @@
                     <pic:cNvPicPr/>
                   </pic:nvPicPr>
                   <pic:blipFill>
-                    <a:blip r:embed="rId12"/>
+                    <a:blip r:embed="rId16"/>
                     <a:stretch>
                       <a:fillRect/>
                     </a:stretch>
@@ -959,6 +1206,196 @@
       </w:pPr>
     </w:p>
     <w:p>
+      <w:r>
+        <w:rPr>
+          <w:b/>
+          <w:bCs/>
+        </w:rPr>
+        <w:t>Date:</w:t>
+      </w:r>
+      <w:r>
+        <w:rPr>
+          <w:b/>
+          <w:bCs/>
+        </w:rPr>
+        <w:t xml:space="preserve"> </w:t>
+      </w:r>
+      <w:r>
+        <w:t>31</w:t>
+      </w:r>
+      <w:r>
+        <w:t>/08/2026</w:t>
+      </w:r>
+    </w:p>
+    <w:p>
+      <w:r>
+        <w:rPr>
+          <w:b/>
+          <w:bCs/>
+        </w:rPr>
+        <w:t>What’s being tested:</w:t>
+      </w:r>
+      <w:r>
+        <w:rPr>
+          <w:b/>
+          <w:bCs/>
+        </w:rPr>
+        <w:t xml:space="preserve"> </w:t>
+      </w:r>
+      <w:r>
+        <w:t xml:space="preserve">Error handling. </w:t>
+      </w:r>
+      <w:r>
+        <w:t>When MIDI port closes while the app is running, app should not crash or throw errors.</w:t>
+      </w:r>
+    </w:p>
+    <w:p>
+      <w:r>
+        <w:rPr>
+          <w:b/>
+          <w:bCs/>
+        </w:rPr>
+        <w:t>Pass/Fail:</w:t>
+      </w:r>
+      <w:r>
+        <w:rPr>
+          <w:b/>
+          <w:bCs/>
+        </w:rPr>
+        <w:t xml:space="preserve"> </w:t>
+      </w:r>
+      <w:r>
+        <w:t xml:space="preserve">Fail, although I had already </w:t>
+      </w:r>
+      <w:r>
+        <w:t>implemented code to handle no</w:t>
+      </w:r>
+      <w:r>
+        <w:t xml:space="preserve"> MIDI port on startup, the program will still throw errors when the port is closed while</w:t>
+      </w:r>
+      <w:r>
+        <w:t xml:space="preserve"> it is running.</w:t>
+      </w:r>
+    </w:p>
+    <w:p>
+      <w:r>
+        <w:rPr>
+          <w:noProof/>
+        </w:rPr>
+        <w:drawing>
+          <wp:inline distT="0" distB="0" distL="0" distR="0" wp14:anchorId="4B2C6D5D" wp14:editId="0965F46A">
+            <wp:extent cx="5731510" cy="676910"/>
+            <wp:effectExtent l="0" t="0" r="2540" b="8890"/>
+            <wp:docPr id="1924349116" name="Picture 1"/>
+            <wp:cNvGraphicFramePr>
+              <a:graphicFrameLocks xmlns:a="http://schemas.openxmlformats.org/drawingml/2006/main" noChangeAspect="1"/>
+            </wp:cNvGraphicFramePr>
+            <a:graphic xmlns:a="http://schemas.openxmlformats.org/drawingml/2006/main">
+              <a:graphicData uri="http://schemas.openxmlformats.org/drawingml/2006/picture">
+                <pic:pic xmlns:pic="http://schemas.openxmlformats.org/drawingml/2006/picture">
+                  <pic:nvPicPr>
+                    <pic:cNvPr id="1924349116" name=""/>
+                    <pic:cNvPicPr/>
+                  </pic:nvPicPr>
+                  <pic:blipFill>
+                    <a:blip r:embed="rId17"/>
+                    <a:stretch>
+                      <a:fillRect/>
+                    </a:stretch>
+                  </pic:blipFill>
+                  <pic:spPr>
+                    <a:xfrm>
+                      <a:off x="0" y="0"/>
+                      <a:ext cx="5731510" cy="676910"/>
+                    </a:xfrm>
+                    <a:prstGeom prst="rect">
+                      <a:avLst/>
+                    </a:prstGeom>
+                  </pic:spPr>
+                </pic:pic>
+              </a:graphicData>
+            </a:graphic>
+          </wp:inline>
+        </w:drawing>
+      </w:r>
+    </w:p>
+    <w:p>
+      <w:r>
+        <w:rPr>
+          <w:b/>
+          <w:bCs/>
+        </w:rPr>
+        <w:t>Changes made:</w:t>
+      </w:r>
+      <w:r>
+        <w:rPr>
+          <w:b/>
+          <w:bCs/>
+        </w:rPr>
+        <w:t xml:space="preserve"> </w:t>
+      </w:r>
+      <w:r>
+        <w:t xml:space="preserve">Prior to this fix, the program only checked for the missing MIDI port error once on launch. Now, a loop runs every </w:t>
+      </w:r>
+      <w:r>
+        <w:t>second to check whether the messages are being sent successfully.</w:t>
+      </w:r>
+      <w:r>
+        <w:rPr>
+          <w:noProof/>
+        </w:rPr>
+        <w:t xml:space="preserve"> </w:t>
+      </w:r>
+      <w:r>
+        <w:rPr>
+          <w:noProof/>
+        </w:rPr>
+        <w:drawing>
+          <wp:inline distT="0" distB="0" distL="0" distR="0" wp14:anchorId="26C61122" wp14:editId="5A275371">
+            <wp:extent cx="5731510" cy="1562100"/>
+            <wp:effectExtent l="0" t="0" r="2540" b="0"/>
+            <wp:docPr id="116152412" name="Picture 1"/>
+            <wp:cNvGraphicFramePr>
+              <a:graphicFrameLocks xmlns:a="http://schemas.openxmlformats.org/drawingml/2006/main" noChangeAspect="1"/>
+            </wp:cNvGraphicFramePr>
+            <a:graphic xmlns:a="http://schemas.openxmlformats.org/drawingml/2006/main">
+              <a:graphicData uri="http://schemas.openxmlformats.org/drawingml/2006/picture">
+                <pic:pic xmlns:pic="http://schemas.openxmlformats.org/drawingml/2006/picture">
+                  <pic:nvPicPr>
+                    <pic:cNvPr id="116152412" name=""/>
+                    <pic:cNvPicPr/>
+                  </pic:nvPicPr>
+                  <pic:blipFill>
+                    <a:blip r:embed="rId18"/>
+                    <a:stretch>
+                      <a:fillRect/>
+                    </a:stretch>
+                  </pic:blipFill>
+                  <pic:spPr>
+                    <a:xfrm>
+                      <a:off x="0" y="0"/>
+                      <a:ext cx="5731510" cy="1562100"/>
+                    </a:xfrm>
+                    <a:prstGeom prst="rect">
+                      <a:avLst/>
+                    </a:prstGeom>
+                  </pic:spPr>
+                </pic:pic>
+              </a:graphicData>
+            </a:graphic>
+          </wp:inline>
+        </w:drawing>
+      </w:r>
+    </w:p>
+    <w:p>
+      <w:pPr>
+        <w:rPr>
+          <w:b/>
+          <w:bCs/>
+        </w:rPr>
+      </w:pPr>
+    </w:p>
+    <w:p>
       <w:pPr>
         <w:pStyle w:val="Heading1"/>
       </w:pPr>
@@ -1004,7 +1441,15 @@
         <w:t xml:space="preserve"> </w:t>
       </w:r>
       <w:r>
-        <w:t>Mobile users are able to switch tabs</w:t>
+        <w:t xml:space="preserve">Mobile users </w:t>
+      </w:r>
+      <w:proofErr w:type="gramStart"/>
+      <w:r>
+        <w:t>are able to</w:t>
+      </w:r>
+      <w:proofErr w:type="gramEnd"/>
+      <w:r>
+        <w:t xml:space="preserve"> switch tabs</w:t>
       </w:r>
       <w:r>
         <w:t xml:space="preserve"> smoothly</w:t>
@@ -1015,6 +1460,7 @@
         <w:rPr>
           <w:noProof/>
         </w:rPr>
+        <w:lastRenderedPageBreak/>
         <w:drawing>
           <wp:anchor distT="0" distB="0" distL="114300" distR="114300" simplePos="0" relativeHeight="251658240" behindDoc="0" locked="0" layoutInCell="1" allowOverlap="1" wp14:anchorId="2A8AF387" wp14:editId="186FEADB">
             <wp:simplePos x="0" y="0"/>
@@ -1039,7 +1485,7 @@
                     <pic:cNvPicPr/>
                   </pic:nvPicPr>
                   <pic:blipFill>
-                    <a:blip r:embed="rId13" cstate="print">
+                    <a:blip r:embed="rId19" cstate="print">
                       <a:extLst>
                         <a:ext uri="{28A0092B-C50C-407E-A947-70E740481C1C}">
                           <a14:useLocalDpi xmlns:a14="http://schemas.microsoft.com/office/drawing/2010/main" val="0"/>
@@ -1091,8 +1537,13 @@
       <w:r>
         <w:t xml:space="preserve"> freeze briefly. I believe this is due to the need for </w:t>
       </w:r>
-      <w:r>
-        <w:t>NiceGUI to redraw the page every time</w:t>
+      <w:proofErr w:type="spellStart"/>
+      <w:r>
+        <w:t>NiceGUI</w:t>
+      </w:r>
+      <w:proofErr w:type="spellEnd"/>
+      <w:r>
+        <w:t xml:space="preserve"> to redraw the page every time</w:t>
       </w:r>
       <w:r>
         <w:rPr>
@@ -1135,7 +1586,15 @@
         <w:t xml:space="preserve"> </w:t>
       </w:r>
       <w:r>
-        <w:t>This means that the program only has to draw the pages once and not every time the user changes tabs</w:t>
+        <w:t xml:space="preserve">This means that the program only </w:t>
+      </w:r>
+      <w:proofErr w:type="gramStart"/>
+      <w:r>
+        <w:t>has to</w:t>
+      </w:r>
+      <w:proofErr w:type="gramEnd"/>
+      <w:r>
+        <w:t xml:space="preserve"> draw the pages once and not every time the user changes tabs</w:t>
       </w:r>
       <w:r>
         <w:t>.</w:t>
@@ -1207,7 +1666,15 @@
         <w:t xml:space="preserve"> </w:t>
       </w:r>
       <w:r>
-        <w:t xml:space="preserve">Fail, gauge does not update because the function that draws the gauge cannot access the updated wah percentage value. This </w:t>
+        <w:t xml:space="preserve">Fail, gauge does not update because the function that draws the gauge cannot access the updated </w:t>
+      </w:r>
+      <w:proofErr w:type="spellStart"/>
+      <w:r>
+        <w:t>wah</w:t>
+      </w:r>
+      <w:proofErr w:type="spellEnd"/>
+      <w:r>
+        <w:t xml:space="preserve"> percentage value. This </w:t>
       </w:r>
       <w:r>
         <w:t>means that the gauge only shows the original value of the shared dictionary.</w:t>
@@ -1259,7 +1726,7 @@
                     <pic:cNvPicPr/>
                   </pic:nvPicPr>
                   <pic:blipFill>
-                    <a:blip r:embed="rId14"/>
+                    <a:blip r:embed="rId20"/>
                     <a:stretch>
                       <a:fillRect/>
                     </a:stretch>
@@ -1309,7 +1776,7 @@
                     <pic:cNvPicPr/>
                   </pic:nvPicPr>
                   <pic:blipFill>
-                    <a:blip r:embed="rId15">
+                    <a:blip r:embed="rId21">
                       <a:extLst>
                         <a:ext uri="{28A0092B-C50C-407E-A947-70E740481C1C}">
                           <a14:useLocalDpi xmlns:a14="http://schemas.microsoft.com/office/drawing/2010/main" val="0"/>
@@ -1351,7 +1818,15 @@
         <w:t xml:space="preserve">declare the </w:t>
       </w:r>
       <w:r>
-        <w:t>global scope for the live_percent variable inside of the thread function</w:t>
+        <w:t xml:space="preserve">global scope for the </w:t>
+      </w:r>
+      <w:proofErr w:type="spellStart"/>
+      <w:r>
+        <w:t>live_percent</w:t>
+      </w:r>
+      <w:proofErr w:type="spellEnd"/>
+      <w:r>
+        <w:t xml:space="preserve"> variable inside of the thread function</w:t>
       </w:r>
       <w:r>
         <w:t xml:space="preserve">. </w:t>
@@ -1370,13 +1845,190 @@
         <w:t>While testing,</w:t>
       </w:r>
       <w:r>
-        <w:t xml:space="preserve"> I replaced the ui.timer line with a while True loop</w:t>
+        <w:t xml:space="preserve"> I replaced the </w:t>
+      </w:r>
+      <w:proofErr w:type="spellStart"/>
+      <w:proofErr w:type="gramStart"/>
+      <w:r>
+        <w:t>ui.timer</w:t>
+      </w:r>
+      <w:proofErr w:type="spellEnd"/>
+      <w:proofErr w:type="gramEnd"/>
+      <w:r>
+        <w:t xml:space="preserve"> line with a while True loop</w:t>
       </w:r>
       <w:r>
         <w:t xml:space="preserve">. This </w:t>
       </w:r>
       <w:r>
-        <w:t>allowed the updated value to be accessed so it has to have something to do with the way NiceGUI works.</w:t>
+        <w:t xml:space="preserve">allowed the updated value to be accessed so it </w:t>
+      </w:r>
+      <w:proofErr w:type="gramStart"/>
+      <w:r>
+        <w:t>has to</w:t>
+      </w:r>
+      <w:proofErr w:type="gramEnd"/>
+      <w:r>
+        <w:t xml:space="preserve"> have something to do with the way </w:t>
+      </w:r>
+      <w:proofErr w:type="spellStart"/>
+      <w:r>
+        <w:t>NiceGUI</w:t>
+      </w:r>
+      <w:proofErr w:type="spellEnd"/>
+      <w:r>
+        <w:t xml:space="preserve"> works.</w:t>
+      </w:r>
+    </w:p>
+    <w:p>
+      <w:pPr>
+        <w:rPr>
+          <w:b/>
+          <w:bCs/>
+        </w:rPr>
+      </w:pPr>
+      <w:r>
+        <w:rPr>
+          <w:b/>
+          <w:bCs/>
+        </w:rPr>
+        <w:lastRenderedPageBreak/>
+        <w:t>10/09/2026</w:t>
+      </w:r>
+    </w:p>
+    <w:p>
+      <w:r>
+        <w:t xml:space="preserve">While trying to create the calibration feature, I encountered the same issue where I could not access the changing value inside the thread. This </w:t>
+      </w:r>
+      <w:r>
+        <w:t>prompted the thought that threading might be the issue, and I’m looking for alternative ways to run the face tracking code in the background.</w:t>
+      </w:r>
+    </w:p>
+    <w:p>
+      <w:r>
+        <w:t xml:space="preserve">I found something called </w:t>
+      </w:r>
+      <w:proofErr w:type="spellStart"/>
+      <w:r>
+        <w:t>asyncio</w:t>
+      </w:r>
+      <w:proofErr w:type="spellEnd"/>
+      <w:r>
+        <w:t xml:space="preserve"> that also does what I need. </w:t>
+      </w:r>
+      <w:proofErr w:type="spellStart"/>
+      <w:r>
+        <w:t>Asyncio</w:t>
+      </w:r>
+      <w:proofErr w:type="spellEnd"/>
+      <w:r>
+        <w:t xml:space="preserve"> is apparently what </w:t>
+      </w:r>
+      <w:proofErr w:type="spellStart"/>
+      <w:r>
+        <w:t>NiceGUI</w:t>
+      </w:r>
+      <w:proofErr w:type="spellEnd"/>
+      <w:r>
+        <w:t xml:space="preserve"> runs on, so I think there won’t be any issues with values not being accessible in the </w:t>
+      </w:r>
+      <w:proofErr w:type="spellStart"/>
+      <w:r>
+        <w:t>NiceGUI</w:t>
+      </w:r>
+      <w:proofErr w:type="spellEnd"/>
+      <w:r>
+        <w:t xml:space="preserve"> </w:t>
+      </w:r>
+      <w:proofErr w:type="spellStart"/>
+      <w:proofErr w:type="gramStart"/>
+      <w:r>
+        <w:t>loop.I</w:t>
+      </w:r>
+      <w:proofErr w:type="spellEnd"/>
+      <w:proofErr w:type="gramEnd"/>
+      <w:r>
+        <w:t xml:space="preserve"> may be able to just use a </w:t>
+      </w:r>
+      <w:proofErr w:type="spellStart"/>
+      <w:proofErr w:type="gramStart"/>
+      <w:r>
+        <w:t>ui.timer</w:t>
+      </w:r>
+      <w:proofErr w:type="spellEnd"/>
+      <w:proofErr w:type="gramEnd"/>
+      <w:r>
+        <w:t xml:space="preserve"> line to run the face tracking loop. To test this, I will create a new file.</w:t>
+      </w:r>
+    </w:p>
+    <w:p>
+      <w:r>
+        <w:t xml:space="preserve">I removed the while loop that housed the frame processing code and put it in a function so that I could use </w:t>
+      </w:r>
+      <w:proofErr w:type="spellStart"/>
+      <w:proofErr w:type="gramStart"/>
+      <w:r>
+        <w:t>ui.timer</w:t>
+      </w:r>
+      <w:proofErr w:type="spellEnd"/>
+      <w:proofErr w:type="gramEnd"/>
+      <w:r>
+        <w:t xml:space="preserve"> to run it. This did indeed fix </w:t>
+      </w:r>
+      <w:proofErr w:type="gramStart"/>
+      <w:r>
+        <w:t>all of</w:t>
+      </w:r>
+      <w:proofErr w:type="gramEnd"/>
+      <w:r>
+        <w:t xml:space="preserve"> my issues with accessing values inside of the thread from other functions outside of it. </w:t>
+      </w:r>
+    </w:p>
+    <w:p>
+      <w:r>
+        <w:drawing>
+          <wp:inline distT="0" distB="0" distL="0" distR="0" wp14:anchorId="1C01D279" wp14:editId="682E8541">
+            <wp:extent cx="2962275" cy="1101089"/>
+            <wp:effectExtent l="0" t="0" r="0" b="4445"/>
+            <wp:docPr id="1239472731" name="Picture 1"/>
+            <wp:cNvGraphicFramePr>
+              <a:graphicFrameLocks xmlns:a="http://schemas.openxmlformats.org/drawingml/2006/main" noChangeAspect="1"/>
+            </wp:cNvGraphicFramePr>
+            <a:graphic xmlns:a="http://schemas.openxmlformats.org/drawingml/2006/main">
+              <a:graphicData uri="http://schemas.openxmlformats.org/drawingml/2006/picture">
+                <pic:pic xmlns:pic="http://schemas.openxmlformats.org/drawingml/2006/picture">
+                  <pic:nvPicPr>
+                    <pic:cNvPr id="1239472731" name=""/>
+                    <pic:cNvPicPr/>
+                  </pic:nvPicPr>
+                  <pic:blipFill>
+                    <a:blip r:embed="rId22"/>
+                    <a:stretch>
+                      <a:fillRect/>
+                    </a:stretch>
+                  </pic:blipFill>
+                  <pic:spPr>
+                    <a:xfrm>
+                      <a:off x="0" y="0"/>
+                      <a:ext cx="2973995" cy="1105446"/>
+                    </a:xfrm>
+                    <a:prstGeom prst="rect">
+                      <a:avLst/>
+                    </a:prstGeom>
+                  </pic:spPr>
+                </pic:pic>
+              </a:graphicData>
+            </a:graphic>
+          </wp:inline>
+        </w:drawing>
+      </w:r>
+    </w:p>
+    <w:p>
+      <w:r>
+        <w:t xml:space="preserve">With this change, the gauge is fixed, and it updates </w:t>
+      </w:r>
+      <w:r>
+        <w:t>in real time according to the percentage of the Wah.</w:t>
       </w:r>
     </w:p>
     <w:p/>
@@ -1492,19 +2144,13 @@
         <w:t xml:space="preserve"> </w:t>
       </w:r>
       <w:r>
-        <w:t>2</w:t>
-      </w:r>
-      <w:r>
-        <w:t>/</w:t>
+        <w:t>2/</w:t>
       </w:r>
       <w:r>
         <w:t>09</w:t>
       </w:r>
       <w:r>
-        <w:t>/</w:t>
-      </w:r>
-      <w:r>
-        <w:t>2026</w:t>
+        <w:t>/2026</w:t>
       </w:r>
     </w:p>
     <w:p>
@@ -1565,6 +2211,10 @@
     </w:p>
     <w:p>
       <w:r>
+        <w:rPr>
+          <w:noProof/>
+        </w:rPr>
+        <w:lastRenderedPageBreak/>
         <w:drawing>
           <wp:inline distT="0" distB="0" distL="0" distR="0" wp14:anchorId="4B43A696" wp14:editId="02E35F89">
             <wp:extent cx="5731510" cy="796925"/>
@@ -1581,7 +2231,7 @@
                     <pic:cNvPicPr/>
                   </pic:nvPicPr>
                   <pic:blipFill>
-                    <a:blip r:embed="rId16"/>
+                    <a:blip r:embed="rId23"/>
                     <a:stretch>
                       <a:fillRect/>
                     </a:stretch>
@@ -1623,8 +2273,11 @@
     </w:p>
     <w:p>
       <w:r>
+        <w:rPr>
+          <w:noProof/>
+        </w:rPr>
         <w:drawing>
-          <wp:anchor distT="0" distB="0" distL="114300" distR="114300" simplePos="0" relativeHeight="251660288" behindDoc="0" locked="0" layoutInCell="1" allowOverlap="1" wp14:anchorId="357ABFD8" wp14:editId="0291FC47">
+          <wp:anchor distT="0" distB="0" distL="114300" distR="114300" simplePos="0" relativeHeight="251660288" behindDoc="0" locked="0" layoutInCell="1" allowOverlap="1" wp14:anchorId="357ABFD8" wp14:editId="3FD1DF3C">
             <wp:simplePos x="0" y="0"/>
             <wp:positionH relativeFrom="column">
               <wp:posOffset>3014662</wp:posOffset>
@@ -1647,7 +2300,7 @@
                     <pic:cNvPicPr/>
                   </pic:nvPicPr>
                   <pic:blipFill>
-                    <a:blip r:embed="rId17" cstate="print">
+                    <a:blip r:embed="rId24" cstate="print">
                       <a:extLst>
                         <a:ext uri="{28A0092B-C50C-407E-A947-70E740481C1C}">
                           <a14:useLocalDpi xmlns:a14="http://schemas.microsoft.com/office/drawing/2010/main" val="0"/>
@@ -2452,7 +3105,7 @@
   <w:style w:type="paragraph" w:default="1" w:styleId="Normal">
     <w:name w:val="Normal"/>
     <w:qFormat/>
-    <w:rsid w:val="00DD15AC"/>
+    <w:rsid w:val="009D504D"/>
   </w:style>
   <w:style w:type="paragraph" w:styleId="Heading1">
     <w:name w:val="heading 1"/>
@@ -2989,6 +3642,47 @@
       </w:tblBorders>
     </w:tblPr>
   </w:style>
+  <w:style w:type="character" w:styleId="Hyperlink">
+    <w:name w:val="Hyperlink"/>
+    <w:basedOn w:val="DefaultParagraphFont"/>
+    <w:uiPriority w:val="99"/>
+    <w:unhideWhenUsed/>
+    <w:rsid w:val="0069699A"/>
+    <w:rPr>
+      <w:color w:val="467886" w:themeColor="hyperlink"/>
+      <w:u w:val="single"/>
+    </w:rPr>
+  </w:style>
+  <w:style w:type="character" w:styleId="UnresolvedMention">
+    <w:name w:val="Unresolved Mention"/>
+    <w:basedOn w:val="DefaultParagraphFont"/>
+    <w:uiPriority w:val="99"/>
+    <w:semiHidden/>
+    <w:unhideWhenUsed/>
+    <w:rsid w:val="0069699A"/>
+    <w:rPr>
+      <w:color w:val="605E5C"/>
+      <w:shd w:val="clear" w:color="auto" w:fill="E1DFDD"/>
+    </w:rPr>
+  </w:style>
+  <w:style w:type="paragraph" w:styleId="Date">
+    <w:name w:val="Date"/>
+    <w:basedOn w:val="Normal"/>
+    <w:next w:val="Normal"/>
+    <w:link w:val="DateChar"/>
+    <w:uiPriority w:val="99"/>
+    <w:semiHidden/>
+    <w:unhideWhenUsed/>
+    <w:rsid w:val="001057D7"/>
+  </w:style>
+  <w:style w:type="character" w:customStyle="1" w:styleId="DateChar">
+    <w:name w:val="Date Char"/>
+    <w:basedOn w:val="DefaultParagraphFont"/>
+    <w:link w:val="Date"/>
+    <w:uiPriority w:val="99"/>
+    <w:semiHidden/>
+    <w:rsid w:val="001057D7"/>
+  </w:style>
 </w:styles>
 </file>
 

</xml_diff>